<commit_message>
Add a <quote> tag for long quotations, rendered as a styled blockquote
The converter now turns <quote>...</quote> in a document into a
blockquote (indented, thin left rule, fractionally smaller type)
instead of stripping it like the metadata tags. Handles a quote
sitting mid-paragraph, not just alone in its own paragraph, since
some documents use soft line breaks throughout rather than hard
paragraph breaks.

Tagged the Tom Paulin review as a live test case.

Co-Authored-By: Claude Sonnet 5 <noreply@anthropic.com>
</commit_message>
<xml_diff>
--- a/content-src/docx/R DT 2025 10 11 Tom Paulin.docx
+++ b/content-src/docx/R DT 2025 10 11 Tom Paulin.docx
@@ -1,6 +1,6 @@
 
 <file path=word/document.xml><?xml version="1.0" encoding="utf-8"?>
-<w:document xmlns:wpc="http://schemas.microsoft.com/office/word/2010/wordprocessingCanvas" xmlns:cx="http://schemas.microsoft.com/office/drawing/2014/chartex" xmlns:cx1="http://schemas.microsoft.com/office/drawing/2015/9/8/chartex" xmlns:cx2="http://schemas.microsoft.com/office/drawing/2015/10/21/chartex" xmlns:cx3="http://schemas.microsoft.com/office/drawing/2016/5/9/chartex" xmlns:cx4="http://schemas.microsoft.com/office/drawing/2016/5/10/chartex" xmlns:cx5="http://schemas.microsoft.com/office/drawing/2016/5/11/chartex" xmlns:cx6="http://schemas.microsoft.com/office/drawing/2016/5/12/chartex" xmlns:cx7="http://schemas.microsoft.com/office/drawing/2016/5/13/chartex" xmlns:cx8="http://schemas.microsoft.com/office/drawing/2016/5/14/chartex" xmlns:mc="http://schemas.openxmlformats.org/markup-compatibility/2006" xmlns:aink="http://schemas.microsoft.com/office/drawing/2016/ink" xmlns:am3d="http://schemas.microsoft.com/office/drawing/2017/model3d" xmlns:o="urn:schemas-microsoft-com:office:office" xmlns:oel="http://schemas.microsoft.com/office/2019/extlst" xmlns:r="http://schemas.openxmlformats.org/officeDocument/2006/relationships" xmlns:m="http://schemas.openxmlformats.org/officeDocument/2006/math" xmlns:v="urn:schemas-microsoft-com:vml" xmlns:wp14="http://schemas.microsoft.com/office/word/2010/wordprocessingDrawing" xmlns:wp="http://schemas.openxmlformats.org/drawingml/2006/wordprocessingDrawing" xmlns:w10="urn:schemas-microsoft-com:office:word" xmlns:w="http://schemas.openxmlformats.org/wordprocessingml/2006/main" xmlns:w14="http://schemas.microsoft.com/office/word/2010/wordml" xmlns:w15="http://schemas.microsoft.com/office/word/2012/wordml" xmlns:w16cei="http://schemas.microsoft.com/office/word/2026/wordml/cei" xmlns:w16cex="http://schemas.microsoft.com/office/word/2018/wordml/cex" xmlns:w16cid="http://schemas.microsoft.com/office/word/2016/wordml/cid" xmlns:w16="http://schemas.microsoft.com/office/word/2018/wordml" xmlns:w16du="http://schemas.microsoft.com/office/word/2023/wordml/word16du" xmlns:w16sdtdh="http://schemas.microsoft.com/office/word/2020/wordml/sdtdatahash" xmlns:w16sdtfl="http://schemas.microsoft.com/office/word/2024/wordml/sdtformatlock" xmlns:w16se="http://schemas.microsoft.com/office/word/2015/wordml/symex" xmlns:wpg="http://schemas.microsoft.com/office/word/2010/wordprocessingGroup" xmlns:wpi="http://schemas.microsoft.com/office/word/2010/wordprocessingInk" xmlns:wne="http://schemas.microsoft.com/office/word/2006/wordml" xmlns:wps="http://schemas.microsoft.com/office/word/2010/wordprocessingShape" mc:Ignorable="w14 w15 w16se w16cid w16 w16cex w16sdtdh w16sdtfl w16du wp14">
+<w:document xmlns:wpc="http://schemas.microsoft.com/office/word/2010/wordprocessingCanvas" xmlns:cx="http://schemas.microsoft.com/office/drawing/2014/chartex" xmlns:cx1="http://schemas.microsoft.com/office/drawing/2015/9/8/chartex" xmlns:cx2="http://schemas.microsoft.com/office/drawing/2015/10/21/chartex" xmlns:cx3="http://schemas.microsoft.com/office/drawing/2016/5/9/chartex" xmlns:cx4="http://schemas.microsoft.com/office/drawing/2016/5/10/chartex" xmlns:cx5="http://schemas.microsoft.com/office/drawing/2016/5/11/chartex" xmlns:cx6="http://schemas.microsoft.com/office/drawing/2016/5/12/chartex" xmlns:cx7="http://schemas.microsoft.com/office/drawing/2016/5/13/chartex" xmlns:cx8="http://schemas.microsoft.com/office/drawing/2016/5/14/chartex" xmlns:mc="http://schemas.openxmlformats.org/markup-compatibility/2006" xmlns:aink="http://schemas.microsoft.com/office/drawing/2016/ink" xmlns:am3d="http://schemas.microsoft.com/office/drawing/2017/model3d" xmlns:o="urn:schemas-microsoft-com:office:office" xmlns:oel="http://schemas.microsoft.com/office/2019/extlst" xmlns:r="http://schemas.openxmlformats.org/officeDocument/2006/relationships" xmlns:m="http://schemas.openxmlformats.org/officeDocument/2006/math" xmlns:v="urn:schemas-microsoft-com:vml" xmlns:wp14="http://schemas.microsoft.com/office/word/2010/wordprocessingDrawing" xmlns:wp="http://schemas.openxmlformats.org/drawingml/2006/wordprocessingDrawing" xmlns:w10="urn:schemas-microsoft-com:office:word" xmlns:w="http://schemas.openxmlformats.org/wordprocessingml/2006/main" xmlns:w14="http://schemas.microsoft.com/office/word/2010/wordml" xmlns:w15="http://schemas.microsoft.com/office/word/2012/wordml" xmlns:w16cex="http://schemas.microsoft.com/office/word/2018/wordml/cex" xmlns:w16cid="http://schemas.microsoft.com/office/word/2016/wordml/cid" xmlns:w16="http://schemas.microsoft.com/office/word/2018/wordml" xmlns:w16du="http://schemas.microsoft.com/office/word/2023/wordml/word16du" xmlns:w16sdtdh="http://schemas.microsoft.com/office/word/2020/wordml/sdtdatahash" xmlns:w16sdtfl="http://schemas.microsoft.com/office/word/2024/wordml/sdtformatlock" xmlns:w16se="http://schemas.microsoft.com/office/word/2015/wordml/symex" xmlns:wpg="http://schemas.microsoft.com/office/word/2010/wordprocessingGroup" xmlns:wpi="http://schemas.microsoft.com/office/word/2010/wordprocessingInk" xmlns:wne="http://schemas.microsoft.com/office/word/2006/wordml" xmlns:wps="http://schemas.microsoft.com/office/word/2010/wordprocessingShape" mc:Ignorable="w14 w15 w16se w16cid w16 w16cex w16sdtdh w16sdtfl w16du wp14">
   <w:body>
     <w:p>
       <w:r>
@@ -34,11 +34,9 @@
       <w:r>
         <w:t xml:space="preserve"> </w:t>
       </w:r>
-      <w:proofErr w:type="spellStart"/>
       <w:r>
         <w:t>Namanlagh</w:t>
       </w:r>
-      <w:proofErr w:type="spellEnd"/>
       <w:r>
         <w:br/>
       </w:r>
@@ -75,15 +73,7 @@
     <w:p>
       <w:r>
         <w:br/>
-        <w:t xml:space="preserve">Where has Tom Paulin been? There have been periodic nostalgic </w:t>
-      </w:r>
-      <w:proofErr w:type="spellStart"/>
-      <w:r>
-        <w:t>frettings</w:t>
-      </w:r>
-      <w:proofErr w:type="spellEnd"/>
-      <w:r>
-        <w:t xml:space="preserve"> on social media in recent years, especially for those long-gone days at the turn of the millennium when Paulin and others (Germaine Greer, Mark Kermode, and Allison Pearson among them), could discuss culture – high to low – with critical zest, for a TV audience, on </w:t>
+        <w:t xml:space="preserve">Where has Tom Paulin been? There have been periodic nostalgic frettings on social media in recent years, especially for those long-gone days at the turn of the millennium when Paulin and others (Germaine Greer, Mark Kermode, and Allison Pearson among them), could discuss culture – high to low – with critical zest, for a TV audience, on </w:t>
       </w:r>
       <w:r>
         <w:rPr>
@@ -93,17 +83,8 @@
         <w:t>Late Review</w:t>
       </w:r>
       <w:r>
-        <w:t xml:space="preserve">. Paulin, with a distinctive Northern Irish accent and a pugnacious, </w:t>
-      </w:r>
-      <w:proofErr w:type="gramStart"/>
-      <w:r>
-        <w:t>politically-inflected</w:t>
-      </w:r>
-      <w:proofErr w:type="gramEnd"/>
-      <w:r>
-        <w:t xml:space="preserve"> contrarianism, was sufficiently famous then to be a favourite of impressionists such as Alistair McGowan. But he has been very quiet for a long time – </w:t>
-      </w:r>
-      <w:proofErr w:type="spellStart"/>
+        <w:t xml:space="preserve">. Paulin, with a distinctive Northern Irish accent and a pugnacious, politically-inflected contrarianism, was sufficiently famous then to be a favourite of impressionists such as Alistair McGowan. But he has been very quiet for a long time – </w:t>
+      </w:r>
       <w:r>
         <w:rPr>
           <w:i/>
@@ -111,7 +92,6 @@
         </w:rPr>
         <w:t>Namanlagh</w:t>
       </w:r>
-      <w:proofErr w:type="spellEnd"/>
       <w:r>
         <w:t xml:space="preserve"> (recently shortlisted for the TS Eliot Prize) is his first new book of poems since the well-received, ruminative collection </w:t>
       </w:r>
@@ -138,7 +118,6 @@
       <w:r>
         <w:br/>
       </w:r>
-      <w:proofErr w:type="spellStart"/>
       <w:r>
         <w:rPr>
           <w:i/>
@@ -146,23 +125,19 @@
         </w:rPr>
         <w:t>Namanlagh</w:t>
       </w:r>
-      <w:proofErr w:type="spellEnd"/>
-      <w:r>
-        <w:t xml:space="preserve"> itself offers an explanation for Paulin’s relative silence over the past decade: the early poems speak, with ironic eloquence, of depression and writer’s block. “Nothing to Be Said” – a consciously Larkin-</w:t>
-      </w:r>
-      <w:proofErr w:type="spellStart"/>
-      <w:r>
-        <w:t>esque</w:t>
-      </w:r>
-      <w:proofErr w:type="spellEnd"/>
-      <w:r>
-        <w:t xml:space="preserve"> title – recalls a week alone in a rented room, hoping to reignite the poetic fire, and failing.</w:t>
-      </w:r>
-      <w:r>
-        <w:br/>
-      </w:r>
-      <w:r>
-        <w:br/>
+      <w:r>
+        <w:t xml:space="preserve"> itself offers an explanation for Paulin’s relative silence over the past decade: the early poems speak, with ironic eloquence, of depression and writer’s block. “Nothing to Be Said” – a consciously Larkin-esque title – recalls a week alone in a rented room, hoping to reignite the poetic fire, and failing.</w:t>
+      </w:r>
+      <w:r>
+        <w:br/>
+      </w:r>
+      <w:r>
+        <w:br/>
+      </w:r>
+      <w:r>
+        <w:t>&lt;quote&gt;</w:t>
+      </w:r>
+      <w:r>
         <w:t>What’s this like? I asked myself.</w:t>
       </w:r>
       <w:r>
@@ -184,6 +159,12 @@
       <w:r>
         <w:br/>
         <w:t>at least filled your days with something to do.</w:t>
+      </w:r>
+      <w:r>
+        <w:t xml:space="preserve"> </w:t>
+      </w:r>
+      <w:r>
+        <w:t>&lt;/quote&gt;</w:t>
       </w:r>
       <w:r>
         <w:br/>
@@ -200,6 +181,11 @@
       </w:r>
       <w:r>
         <w:br/>
+      </w:r>
+      <w:r>
+        <w:t>&lt;quote&gt;</w:t>
+      </w:r>
+      <w:r>
         <w:t>… a tummy-tucked Eve</w:t>
       </w:r>
       <w:r>
@@ -221,6 +207,15 @@
       <w:r>
         <w:br/>
         <w:t>rising from the dissection table</w:t>
+      </w:r>
+      <w:r>
+        <w:t>&lt;</w:t>
+      </w:r>
+      <w:r>
+        <w:t>/</w:t>
+      </w:r>
+      <w:r>
+        <w:t>quote&gt;</w:t>
       </w:r>
       <w:r>
         <w:br/>
@@ -253,7 +248,6 @@
         <w:br/>
         <w:t xml:space="preserve">For decades Paulin was the laureate of deadlock – lovers at odds; policed borders; blockage, obstacle, standoff. </w:t>
       </w:r>
-      <w:proofErr w:type="spellStart"/>
       <w:r>
         <w:rPr>
           <w:i/>
@@ -261,7 +255,6 @@
         </w:rPr>
         <w:t>Namanlagh</w:t>
       </w:r>
-      <w:proofErr w:type="spellEnd"/>
       <w:r>
         <w:t xml:space="preserve"> contains a few of Paulin’s translations of poems by the Palestinian poet Walid Khazindar; analogies between the Northern Irish and the Palestinian situations have long been evident in the competing flags of Belfast’s neighbourhoods.</w:t>
       </w:r>
@@ -272,7 +265,6 @@
         <w:br/>
         <w:t xml:space="preserve">But even if it mostly revisits familiar ground, </w:t>
       </w:r>
-      <w:proofErr w:type="spellStart"/>
       <w:r>
         <w:rPr>
           <w:i/>
@@ -280,7 +272,6 @@
         </w:rPr>
         <w:t>Namanlagh</w:t>
       </w:r>
-      <w:proofErr w:type="spellEnd"/>
       <w:r>
         <w:t xml:space="preserve"> nonetheless reminds one how good Paulin is at rendering movements of mind and eye and memory – flickering via jazzy associations of sound and shape – and how well he conveys first the materiality of ordinary objects, and then the associations they carry with them. “Edge of Town” describes a path surrounded on each side by metal railings, which first remind him, in “an image I’ll never draw or paint”, of “two vast armies / of abstract soldiers eyeball to eyeball”.</w:t>
       </w:r>

</xml_diff>